<commit_message>
Resultados ready para esta entrega :)
</commit_message>
<xml_diff>
--- a/output/tables/resultados/anexo_h1.docx
+++ b/output/tables/resultados/anexo_h1.docx
@@ -71,7 +71,7 @@
         <w:gridCol w:w="1837"/>
         <w:gridCol w:w="1499"/>
         <w:gridCol w:w="1399"/>
-        <w:gridCol w:w="1837"/>
+        <w:gridCol w:w="1737"/>
       </w:tblGrid>
       <w:tr>
         <w:trPr>
@@ -922,7 +922,7 @@
                 <w:szCs w:val="20"/>
                 <w:color w:val="000000"/>
               </w:rPr>
-              <w:t xml:space="preserve">47,6 [37,8; 57,6]</w:t>
+              <w:t xml:space="preserve">−47,6 [−57,6; −37,8]</w:t>
             </w:r>
           </w:p>
         </w:tc>
@@ -1087,7 +1087,7 @@
                 <w:szCs w:val="20"/>
                 <w:color w:val="000000"/>
               </w:rPr>
-              <w:t xml:space="preserve">−2,6 [−6,2; −0,2]</w:t>
+              <w:t xml:space="preserve">2,6 [0,2; 6,2]</w:t>
             </w:r>
           </w:p>
         </w:tc>
@@ -1313,7 +1313,7 @@
                 <w:szCs w:val="20"/>
                 <w:color w:val="000000"/>
               </w:rPr>
-              <w:t xml:space="preserve">21,9 [13,6; 30,6]</w:t>
+              <w:t xml:space="preserve">−21,9 [−30,6; −13,6]</w:t>
             </w:r>
           </w:p>
         </w:tc>
@@ -1478,7 +1478,7 @@
                 <w:szCs w:val="20"/>
                 <w:color w:val="000000"/>
               </w:rPr>
-              <w:t xml:space="preserve">−40,5 [−51,4; −30,5]</w:t>
+              <w:t xml:space="preserve">40,5 [30,5; 51,4]</w:t>
             </w:r>
           </w:p>
         </w:tc>
@@ -1704,7 +1704,7 @@
                 <w:szCs w:val="20"/>
                 <w:color w:val="000000"/>
               </w:rPr>
-              <w:t xml:space="preserve">39,2 [29,7; 48,9]</w:t>
+              <w:t xml:space="preserve">−39,2 [−48,9; −29,7]</w:t>
             </w:r>
           </w:p>
         </w:tc>
@@ -1869,7 +1869,7 @@
                 <w:szCs w:val="20"/>
                 <w:color w:val="000000"/>
               </w:rPr>
-              <w:t xml:space="preserve">−2,8 [−8,4; 2,8]</w:t>
+              <w:t xml:space="preserve">2,8 [−2,8; 8,4]</w:t>
             </w:r>
           </w:p>
         </w:tc>
@@ -2095,7 +2095,7 @@
                 <w:szCs w:val="20"/>
                 <w:color w:val="000000"/>
               </w:rPr>
-              <w:t xml:space="preserve">36,9 [28,5; 44,9]</w:t>
+              <w:t xml:space="preserve">−36,9 [−44,9; −28,5]</w:t>
             </w:r>
           </w:p>
         </w:tc>
@@ -2260,7 +2260,7 @@
                 <w:szCs w:val="20"/>
                 <w:color w:val="000000"/>
               </w:rPr>
-              <w:t xml:space="preserve">−21,5 [−29,6; −15,1]</w:t>
+              <w:t xml:space="preserve">21,5 [15,1; 29,6]</w:t>
             </w:r>
           </w:p>
         </w:tc>
@@ -2486,7 +2486,7 @@
                 <w:szCs w:val="20"/>
                 <w:color w:val="000000"/>
               </w:rPr>
-              <w:t xml:space="preserve">0,5 [−10,8; 12,5]</w:t>
+              <w:t xml:space="preserve">−0,5 [−12,5; 10,8]</w:t>
             </w:r>
           </w:p>
         </w:tc>
@@ -2877,7 +2877,7 @@
                 <w:szCs w:val="20"/>
                 <w:color w:val="000000"/>
               </w:rPr>
-              <w:t xml:space="preserve">22,4 [15,2; 30,1]</w:t>
+              <w:t xml:space="preserve">−22,4 [−30,1; −15,2]</w:t>
             </w:r>
           </w:p>
         </w:tc>
@@ -3042,7 +3042,7 @@
                 <w:szCs w:val="20"/>
                 <w:color w:val="000000"/>
               </w:rPr>
-              <w:t xml:space="preserve">5,6 [0,1; 12,0]</w:t>
+              <w:t xml:space="preserve">−5,6 [−12,0; −0,1]</w:t>
             </w:r>
           </w:p>
         </w:tc>
@@ -3268,7 +3268,7 @@
                 <w:szCs w:val="20"/>
                 <w:color w:val="000000"/>
               </w:rPr>
-              <w:t xml:space="preserve">3,9 [−4,0; 11,6]</w:t>
+              <w:t xml:space="preserve">−3,9 [−11,6; 4,0]</w:t>
             </w:r>
           </w:p>
         </w:tc>
@@ -3433,7 +3433,7 @@
                 <w:szCs w:val="20"/>
                 <w:color w:val="000000"/>
               </w:rPr>
-              <w:t xml:space="preserve">0,1 [−1,0; 1,7]</w:t>
+              <w:t xml:space="preserve">−0,1 [−1,7; 1,0]</w:t>
             </w:r>
           </w:p>
         </w:tc>
@@ -3721,7 +3721,7 @@
                 <w:szCs w:val="20"/>
                 <w:color w:val="000000"/>
               </w:rPr>
-              <w:t xml:space="preserve">−29,9 [−41,6; −19,2]</w:t>
+              <w:t xml:space="preserve">29,9 [19,2; 41,6]</w:t>
             </w:r>
           </w:p>
         </w:tc>
@@ -4112,7 +4112,7 @@
                 <w:szCs w:val="20"/>
                 <w:color w:val="000000"/>
               </w:rPr>
-              <w:t xml:space="preserve">−4,9 [−14,2; 4,6]</w:t>
+              <w:t xml:space="preserve">4,9 [−4,6; 14,2]</w:t>
             </w:r>
           </w:p>
         </w:tc>
@@ -4277,7 +4277,7 @@
                 <w:szCs w:val="20"/>
                 <w:color w:val="000000"/>
               </w:rPr>
-              <w:t xml:space="preserve">0,3 [0,0; 2,0]</w:t>
+              <w:t xml:space="preserve">−0,3 [−2,0; 0,0]</w:t>
             </w:r>
           </w:p>
         </w:tc>
@@ -4503,7 +4503,7 @@
                 <w:szCs w:val="20"/>
                 <w:color w:val="000000"/>
               </w:rPr>
-              <w:t xml:space="preserve">−9,7 [−16,0; −3,9]</w:t>
+              <w:t xml:space="preserve">9,7 [3,9; 16,0]</w:t>
             </w:r>
           </w:p>
         </w:tc>
@@ -4668,7 +4668,7 @@
                 <w:szCs w:val="20"/>
                 <w:color w:val="000000"/>
               </w:rPr>
-              <w:t xml:space="preserve">1,5 [0,0; 4,4]</w:t>
+              <w:t xml:space="preserve">−1,5 [−4,4; 0,0]</w:t>
             </w:r>
           </w:p>
         </w:tc>
@@ -4894,7 +4894,7 @@
                 <w:szCs w:val="20"/>
                 <w:color w:val="000000"/>
               </w:rPr>
-              <w:t xml:space="preserve">−7,3 [−12,1; −3,5]</w:t>
+              <w:t xml:space="preserve">7,3 [3,5; 12,1]</w:t>
             </w:r>
           </w:p>
         </w:tc>
@@ -5059,7 +5059,7 @@
                 <w:szCs w:val="20"/>
                 <w:color w:val="000000"/>
               </w:rPr>
-              <w:t xml:space="preserve">12,9 [7,2; 19,3]</w:t>
+              <w:t xml:space="preserve">−12,9 [−19,3; −7,2]</w:t>
             </w:r>
           </w:p>
         </w:tc>
@@ -5285,7 +5285,7 @@
                 <w:szCs w:val="20"/>
                 <w:color w:val="000000"/>
               </w:rPr>
-              <w:t xml:space="preserve">−26,5 [−34,0; −20,3]</w:t>
+              <w:t xml:space="preserve">26,5 [20,3; 34,0]</w:t>
             </w:r>
           </w:p>
         </w:tc>
@@ -5525,7 +5525,7 @@
                 <w:szCs w:val="20"/>
                 <w:color w:val="000000"/>
               </w:rPr>
-              <w:t xml:space="preserve"> Probabilidad predicha (%) de que una intervención sustantiva apoye o rechace cada concepto, a partir de dos modelos logísticos multinivel (apoyo y rechazo), e intervalos de confianza del 95 % entre corchetes, obtenidos con 1.000 remuestreos de actores dentro de cada bloque. Δ corresponde a derecha menos izquierda, en puntos porcentuales. 4.212 observaciones (intervención × concepto) de 351 intervenciones y 183 actores. La especificación se presenta en el Anexo 4.</w:t>
+              <w:t xml:space="preserve"> Probabilidad predicha (%) de que una intervención sustantiva apoye o rechace cada concepto, a partir de dos modelos logísticos multinivel (apoyo y rechazo), e intervalos de confianza del 95 % entre corchetes, obtenidos con 1.000 remuestreos de actores dentro de cada bloque. Δ corresponde a izquierda menos derecha, en puntos porcentuales. 4.212 observaciones (intervención × concepto) de 351 intervenciones y 183 actores. La especificación se presenta en el Anexo 4.</w:t>
             </w:r>
           </w:p>
         </w:tc>

</xml_diff>